<commit_message>
docs(cotizacion): portal público activado + documentación /docs + informe cliente
- Fix React hooks violation en QuotationDetail.tsx: useAuthStore declarado después de early returns → movido antes del primer return
- automatizacionesContent.ts: nueva entrada 'notificador-cotizacion' con flujo completo WhatsApp
- docsData.ts: nueva habilidad 'portal-publico-cotizacion' documentando el portal sin login
- informe-cliente-2026-06-11.docx: sección nueva con 3 módulos activados hoy

Co-Authored-By: Claude Sonnet 4.6 <noreply@anthropic.com>
</commit_message>
<xml_diff>
--- a/docs/informe-cliente-2026-06-11.docx
+++ b/docs/informe-cliente-2026-06-11.docx
@@ -4870,6 +4870,330 @@
                 <w:szCs w:val="18"/>
               </w:rPr>
               <w:t xml:space="preserve">Todas las notificaciones tienen claves únicas de deduplicación. Imposible que el cliente reciba el mismo mensaje dos veces por error del sistema.</w:t>
+            </w:r>
+          </w:p>
+        </w:tc>
+      </w:tr>
+    </w:tbl>
+    <w:p>
+      <w:pPr>
+        <w:spacing w:after="0" w:before="200"/>
+      </w:pPr>
+      <w:r>
+        <w:t xml:space="preserve"/>
+      </w:r>
+    </w:p>
+    <w:tbl>
+      <w:tblPr>
+        <w:tblW w:type="dxa" w:w="10080"/>
+        <w:tblBorders>
+          <w:top w:val="single" w:color="auto" w:sz="4"/>
+          <w:left w:val="single" w:color="auto" w:sz="4"/>
+          <w:bottom w:val="single" w:color="auto" w:sz="4"/>
+          <w:right w:val="single" w:color="auto" w:sz="4"/>
+          <w:insideH w:val="single" w:color="auto" w:sz="4"/>
+          <w:insideV w:val="single" w:color="auto" w:sz="4"/>
+        </w:tblBorders>
+      </w:tblPr>
+      <w:tblGrid>
+        <w:gridCol w:w="500"/>
+        <w:gridCol w:w="9580"/>
+      </w:tblGrid>
+      <w:tr>
+        <w:tc>
+          <w:tcPr>
+            <w:gridSpan w:val="2"/>
+            <w:tcBorders>
+              <w:top w:val="nil" w:color="auto" w:sz="0"/>
+              <w:left w:val="nil" w:color="auto" w:sz="0"/>
+              <w:bottom w:val="nil" w:color="auto" w:sz="0"/>
+              <w:right w:val="nil" w:color="auto" w:sz="0"/>
+            </w:tcBorders>
+            <w:shd w:fill="0F2028" w:val="clear"/>
+            <w:tcMar>
+              <w:top w:type="dxa" w:w="160"/>
+              <w:left w:type="dxa" w:w="240"/>
+              <w:bottom w:type="dxa" w:w="120"/>
+              <w:right w:type="dxa" w:w="240"/>
+            </w:tcMar>
+          </w:tcPr>
+          <w:p>
+            <w:pPr>
+              <w:spacing w:after="60" w:before="0"/>
+            </w:pPr>
+            <w:r>
+              <w:rPr>
+                <w:rFonts w:ascii="Arial" w:cs="Arial" w:eastAsia="Arial" w:hAnsi="Arial"/>
+                <w:b/>
+                <w:bCs/>
+                <w:color w:val="44DDC1"/>
+                <w:sz w:val="22"/>
+                <w:szCs w:val="22"/>
+              </w:rPr>
+              <w:t xml:space="preserve">ACTUALIZACIÓN 2026-06-11: PORTAL PÚBLICO DE COTIZACIÓN</w:t>
+            </w:r>
+          </w:p>
+          <w:p>
+            <w:pPr>
+              <w:spacing w:after="0" w:before="0"/>
+            </w:pPr>
+            <w:r>
+              <w:rPr>
+                <w:rFonts w:ascii="Arial" w:cs="Arial" w:eastAsia="Arial" w:hAnsi="Arial"/>
+                <w:color w:val="9CA3AF"/>
+                <w:sz w:val="16"/>
+                <w:szCs w:val="16"/>
+              </w:rPr>
+              <w:t xml:space="preserve">3 módulos activados y verificados en esta sesión</w:t>
+            </w:r>
+          </w:p>
+        </w:tc>
+      </w:tr>
+      <w:tr>
+        <w:tc>
+          <w:tcPr>
+            <w:tcW w:type="dxa" w:w="500"/>
+            <w:tcBorders>
+              <w:top w:val="nil" w:color="auto" w:sz="0"/>
+              <w:left w:val="nil" w:color="auto" w:sz="0"/>
+              <w:bottom w:val="single" w:color="F0F4F8" w:sz="1"/>
+              <w:right w:val="nil" w:color="auto" w:sz="0"/>
+            </w:tcBorders>
+            <w:shd w:fill="FFFFFF" w:val="clear"/>
+            <w:tcMar>
+              <w:top w:type="dxa" w:w="120"/>
+              <w:left w:type="dxa" w:w="200"/>
+              <w:bottom w:type="dxa" w:w="120"/>
+              <w:right w:type="dxa" w:w="80"/>
+            </w:tcMar>
+            <w:vAlign w:val="top"/>
+          </w:tcPr>
+          <w:p>
+            <w:pPr>
+              <w:spacing w:after="0" w:before="0"/>
+            </w:pPr>
+            <w:r>
+              <w:rPr>
+                <w:rFonts w:ascii="Segoe UI Emoji" w:cs="Segoe UI Emoji" w:eastAsia="Segoe UI Emoji" w:hAnsi="Segoe UI Emoji"/>
+                <w:sz w:val="20"/>
+                <w:szCs w:val="20"/>
+              </w:rPr>
+              <w:t xml:space="preserve">✅</w:t>
+            </w:r>
+          </w:p>
+        </w:tc>
+        <w:tc>
+          <w:tcPr>
+            <w:tcW w:type="dxa" w:w="9580"/>
+            <w:tcBorders>
+              <w:top w:val="nil" w:color="auto" w:sz="0"/>
+              <w:left w:val="nil" w:color="auto" w:sz="0"/>
+              <w:bottom w:val="single" w:color="F0F4F8" w:sz="1"/>
+              <w:right w:val="nil" w:color="auto" w:sz="0"/>
+            </w:tcBorders>
+            <w:shd w:fill="FFFFFF" w:val="clear"/>
+            <w:tcMar>
+              <w:top w:type="dxa" w:w="120"/>
+              <w:left w:type="dxa" w:w="80"/>
+              <w:bottom w:type="dxa" w:w="120"/>
+              <w:right w:type="dxa" w:w="200"/>
+            </w:tcMar>
+            <w:vAlign w:val="top"/>
+          </w:tcPr>
+          <w:p>
+            <w:pPr>
+              <w:spacing w:after="40" w:before="0"/>
+            </w:pPr>
+            <w:r>
+              <w:rPr>
+                <w:rFonts w:ascii="Arial" w:cs="Arial" w:eastAsia="Arial" w:hAnsi="Arial"/>
+                <w:b/>
+                <w:bCs/>
+                <w:color w:val="1A2332"/>
+                <w:sz w:val="20"/>
+                <w:szCs w:val="20"/>
+              </w:rPr>
+              <w:t xml:space="preserve">Portal Público de Cotización</w:t>
+            </w:r>
+          </w:p>
+          <w:p>
+            <w:pPr>
+              <w:spacing w:after="0" w:before="0"/>
+            </w:pPr>
+            <w:r>
+              <w:rPr>
+                <w:rFonts w:ascii="Arial" w:cs="Arial" w:eastAsia="Arial" w:hAnsi="Arial"/>
+                <w:color w:val="4B5563"/>
+                <w:sz w:val="18"/>
+                <w:szCs w:val="18"/>
+              </w:rPr>
+              <w:t xml:space="preserve">El cliente accede a su cotización completa desde un enlace único con token, sin necesitar cuenta ni contraseña. Puede verla y aprobarla desde cualquier dispositivo. Ruta: /c/&lt;short_code&gt;. Enlace válido por 30 días (configurable). Activado con feature flag VITE_FF_PHASE_4_QUOTATION_PUBLIC.</w:t>
+            </w:r>
+          </w:p>
+        </w:tc>
+      </w:tr>
+      <w:tr>
+        <w:tc>
+          <w:tcPr>
+            <w:tcW w:type="dxa" w:w="500"/>
+            <w:tcBorders>
+              <w:top w:val="nil" w:color="auto" w:sz="0"/>
+              <w:left w:val="nil" w:color="auto" w:sz="0"/>
+              <w:bottom w:val="single" w:color="F0F4F8" w:sz="1"/>
+              <w:right w:val="nil" w:color="auto" w:sz="0"/>
+            </w:tcBorders>
+            <w:shd w:fill="FFFFFF" w:val="clear"/>
+            <w:tcMar>
+              <w:top w:type="dxa" w:w="120"/>
+              <w:left w:type="dxa" w:w="200"/>
+              <w:bottom w:type="dxa" w:w="120"/>
+              <w:right w:type="dxa" w:w="80"/>
+            </w:tcMar>
+            <w:vAlign w:val="top"/>
+          </w:tcPr>
+          <w:p>
+            <w:pPr>
+              <w:spacing w:after="0" w:before="0"/>
+            </w:pPr>
+            <w:r>
+              <w:rPr>
+                <w:rFonts w:ascii="Segoe UI Emoji" w:cs="Segoe UI Emoji" w:eastAsia="Segoe UI Emoji" w:hAnsi="Segoe UI Emoji"/>
+                <w:sz w:val="20"/>
+                <w:szCs w:val="20"/>
+              </w:rPr>
+              <w:t xml:space="preserve">✅</w:t>
+            </w:r>
+          </w:p>
+        </w:tc>
+        <w:tc>
+          <w:tcPr>
+            <w:tcW w:type="dxa" w:w="9580"/>
+            <w:tcBorders>
+              <w:top w:val="nil" w:color="auto" w:sz="0"/>
+              <w:left w:val="nil" w:color="auto" w:sz="0"/>
+              <w:bottom w:val="single" w:color="F0F4F8" w:sz="1"/>
+              <w:right w:val="nil" w:color="auto" w:sz="0"/>
+            </w:tcBorders>
+            <w:shd w:fill="FFFFFF" w:val="clear"/>
+            <w:tcMar>
+              <w:top w:type="dxa" w:w="120"/>
+              <w:left w:type="dxa" w:w="80"/>
+              <w:bottom w:type="dxa" w:w="120"/>
+              <w:right w:type="dxa" w:w="200"/>
+            </w:tcMar>
+            <w:vAlign w:val="top"/>
+          </w:tcPr>
+          <w:p>
+            <w:pPr>
+              <w:spacing w:after="40" w:before="0"/>
+            </w:pPr>
+            <w:r>
+              <w:rPr>
+                <w:rFonts w:ascii="Arial" w:cs="Arial" w:eastAsia="Arial" w:hAnsi="Arial"/>
+                <w:b/>
+                <w:bCs/>
+                <w:color w:val="1A2332"/>
+                <w:sz w:val="20"/>
+                <w:szCs w:val="20"/>
+              </w:rPr>
+              <w:t xml:space="preserve">Notificador WhatsApp de Cotización</w:t>
+            </w:r>
+          </w:p>
+          <w:p>
+            <w:pPr>
+              <w:spacing w:after="0" w:before="0"/>
+            </w:pPr>
+            <w:r>
+              <w:rPr>
+                <w:rFonts w:ascii="Arial" w:cs="Arial" w:eastAsia="Arial" w:hAnsi="Arial"/>
+                <w:color w:val="4B5563"/>
+                <w:sz w:val="18"/>
+                <w:szCs w:val="18"/>
+              </w:rPr>
+              <w:t xml:space="preserve">Al hacer clic en “Enviar al cliente”, el sistema genera automáticamente el token, calcula el vencimiento (30 días) y despacha un WhatsApp con la template Meta aprobada quotation_sent_v1. El cliente recibe: su nombre, número de cotización y enlace directo. La Edge Function process-whatsapp-notifications procesa la cola cada 60 segundos.</w:t>
+            </w:r>
+          </w:p>
+        </w:tc>
+      </w:tr>
+      <w:tr>
+        <w:tc>
+          <w:tcPr>
+            <w:tcW w:type="dxa" w:w="500"/>
+            <w:tcBorders>
+              <w:top w:val="nil" w:color="auto" w:sz="0"/>
+              <w:left w:val="nil" w:color="auto" w:sz="0"/>
+              <w:bottom w:val="single" w:color="F0F4F8" w:sz="1"/>
+              <w:right w:val="nil" w:color="auto" w:sz="0"/>
+            </w:tcBorders>
+            <w:shd w:fill="FFFFFF" w:val="clear"/>
+            <w:tcMar>
+              <w:top w:type="dxa" w:w="120"/>
+              <w:left w:type="dxa" w:w="200"/>
+              <w:bottom w:type="dxa" w:w="120"/>
+              <w:right w:type="dxa" w:w="80"/>
+            </w:tcMar>
+            <w:vAlign w:val="top"/>
+          </w:tcPr>
+          <w:p>
+            <w:pPr>
+              <w:spacing w:after="0" w:before="0"/>
+            </w:pPr>
+            <w:r>
+              <w:rPr>
+                <w:rFonts w:ascii="Segoe UI Emoji" w:cs="Segoe UI Emoji" w:eastAsia="Segoe UI Emoji" w:hAnsi="Segoe UI Emoji"/>
+                <w:sz w:val="20"/>
+                <w:szCs w:val="20"/>
+              </w:rPr>
+              <w:t xml:space="preserve">✅</w:t>
+            </w:r>
+          </w:p>
+        </w:tc>
+        <w:tc>
+          <w:tcPr>
+            <w:tcW w:type="dxa" w:w="9580"/>
+            <w:tcBorders>
+              <w:top w:val="nil" w:color="auto" w:sz="0"/>
+              <w:left w:val="nil" w:color="auto" w:sz="0"/>
+              <w:bottom w:val="single" w:color="F0F4F8" w:sz="1"/>
+              <w:right w:val="nil" w:color="auto" w:sz="0"/>
+            </w:tcBorders>
+            <w:shd w:fill="FFFFFF" w:val="clear"/>
+            <w:tcMar>
+              <w:top w:type="dxa" w:w="120"/>
+              <w:left w:type="dxa" w:w="80"/>
+              <w:bottom w:type="dxa" w:w="120"/>
+              <w:right w:type="dxa" w:w="200"/>
+            </w:tcMar>
+            <w:vAlign w:val="top"/>
+          </w:tcPr>
+          <w:p>
+            <w:pPr>
+              <w:spacing w:after="40" w:before="0"/>
+            </w:pPr>
+            <w:r>
+              <w:rPr>
+                <w:rFonts w:ascii="Arial" w:cs="Arial" w:eastAsia="Arial" w:hAnsi="Arial"/>
+                <w:b/>
+                <w:bCs/>
+                <w:color w:val="1A2332"/>
+                <w:sz w:val="20"/>
+                <w:szCs w:val="20"/>
+              </w:rPr>
+              <w:t xml:space="preserve">Modo Test de Mensajería (wa_test_phone_override)</w:t>
+            </w:r>
+          </w:p>
+          <w:p>
+            <w:pPr>
+              <w:spacing w:after="0" w:before="0"/>
+            </w:pPr>
+            <w:r>
+              <w:rPr>
+                <w:rFonts w:ascii="Arial" w:cs="Arial" w:eastAsia="Arial" w:hAnsi="Arial"/>
+                <w:color w:val="4B5563"/>
+                <w:sz w:val="18"/>
+                <w:szCs w:val="18"/>
+              </w:rPr>
+              <w:t xml:space="preserve">Parámetro en system_settings que redirige todos los WhatsApp a un número de prueba, sin modificar el código. Activo: todos los mensajes van a 3183061286. Para productión, se borra el valor y los mensajes fluyen al cliente real.</w:t>
             </w:r>
           </w:p>
         </w:tc>

</xml_diff>

<commit_message>
docs: agregar Resumen Semanal de Tareas a /docs y al informe cliente
- automatizacionesContent.ts: automatización #31 resumen-semanal-tareas (realtime, visible, flujo, métricas, pasos)
- docsData.ts: tarjeta sort_order 128 en sección Habilidades
- informe-cliente-2026-06-11.docx: nueva sección ACTUALIZACIÓN 2026-06-11 TARDE con 5 cambios documentados

Co-Authored-By: Claude Sonnet 4.6 <noreply@anthropic.com>
</commit_message>
<xml_diff>
--- a/docs/informe-cliente-2026-06-11.docx
+++ b/docs/informe-cliente-2026-06-11.docx
@@ -5207,6 +5207,488 @@
         <w:t xml:space="preserve"/>
       </w:r>
     </w:p>
+    <w:tbl>
+      <w:tblPr>
+        <w:tblW w:type="dxa" w:w="10080"/>
+        <w:tblBorders>
+          <w:top w:val="single" w:color="auto" w:sz="4"/>
+          <w:left w:val="single" w:color="auto" w:sz="4"/>
+          <w:bottom w:val="single" w:color="auto" w:sz="4"/>
+          <w:right w:val="single" w:color="auto" w:sz="4"/>
+          <w:insideH w:val="single" w:color="auto" w:sz="4"/>
+          <w:insideV w:val="single" w:color="auto" w:sz="4"/>
+        </w:tblBorders>
+      </w:tblPr>
+      <w:tblGrid>
+        <w:gridCol w:w="500"/>
+        <w:gridCol w:w="9580"/>
+      </w:tblGrid>
+      <w:tr>
+        <w:tc>
+          <w:tcPr>
+            <w:gridSpan w:val="2"/>
+            <w:tcBorders>
+              <w:top w:val="nil" w:color="auto" w:sz="0"/>
+              <w:left w:val="nil" w:color="auto" w:sz="0"/>
+              <w:bottom w:val="nil" w:color="auto" w:sz="0"/>
+              <w:right w:val="nil" w:color="auto" w:sz="0"/>
+            </w:tcBorders>
+            <w:shd w:fill="0F2028" w:val="clear"/>
+            <w:tcMar>
+              <w:top w:type="dxa" w:w="160"/>
+              <w:left w:type="dxa" w:w="240"/>
+              <w:bottom w:type="dxa" w:w="120"/>
+              <w:right w:type="dxa" w:w="240"/>
+            </w:tcMar>
+          </w:tcPr>
+          <w:p>
+            <w:pPr>
+              <w:spacing w:after="60" w:before="0"/>
+            </w:pPr>
+            <w:r>
+              <w:rPr>
+                <w:rFonts w:ascii="Arial" w:cs="Arial" w:eastAsia="Arial" w:hAnsi="Arial"/>
+                <w:b/>
+                <w:bCs/>
+                <w:color w:val="44DDC1"/>
+                <w:sz w:val="22"/>
+                <w:szCs w:val="22"/>
+              </w:rPr>
+              <w:t xml:space="preserve">ACTUALIZACIóN 2026-06-11 (TARDE): RESUMEN SEMANAL DE TAREAS Y REORGANIZACIóN DEL DASHBOARD</w:t>
+            </w:r>
+          </w:p>
+          <w:p>
+            <w:pPr>
+              <w:spacing w:after="0" w:before="0"/>
+            </w:pPr>
+            <w:r>
+              <w:rPr>
+                <w:rFonts w:ascii="Arial" w:cs="Arial" w:eastAsia="Arial" w:hAnsi="Arial"/>
+                <w:color w:val="9CA3AF"/>
+                <w:sz w:val="16"/>
+                <w:szCs w:val="16"/>
+              </w:rPr>
+              <w:t xml:space="preserve">5 cambios aplicados y documentados en esta sesión</w:t>
+            </w:r>
+          </w:p>
+        </w:tc>
+      </w:tr>
+      <w:tr>
+        <w:tc>
+          <w:tcPr>
+            <w:tcW w:type="dxa" w:w="500"/>
+            <w:tcBorders>
+              <w:top w:val="nil" w:color="auto" w:sz="0"/>
+              <w:left w:val="nil" w:color="auto" w:sz="0"/>
+              <w:bottom w:val="single" w:color="F0F4F8" w:sz="1"/>
+              <w:right w:val="nil" w:color="auto" w:sz="0"/>
+            </w:tcBorders>
+            <w:shd w:fill="FFFFFF" w:val="clear"/>
+            <w:tcMar>
+              <w:top w:type="dxa" w:w="120"/>
+              <w:left w:type="dxa" w:w="200"/>
+              <w:bottom w:type="dxa" w:w="120"/>
+              <w:right w:type="dxa" w:w="80"/>
+            </w:tcMar>
+            <w:vAlign w:val="top"/>
+          </w:tcPr>
+          <w:p>
+            <w:pPr>
+              <w:spacing w:after="0" w:before="0"/>
+            </w:pPr>
+            <w:r>
+              <w:rPr>
+                <w:rFonts w:ascii="Segoe UI Emoji" w:cs="Segoe UI Emoji" w:eastAsia="Segoe UI Emoji" w:hAnsi="Segoe UI Emoji"/>
+                <w:sz w:val="20"/>
+                <w:szCs w:val="20"/>
+              </w:rPr>
+              <w:t xml:space="preserve">✅</w:t>
+            </w:r>
+          </w:p>
+        </w:tc>
+        <w:tc>
+          <w:tcPr>
+            <w:tcW w:type="dxa" w:w="9580"/>
+            <w:tcBorders>
+              <w:top w:val="nil" w:color="auto" w:sz="0"/>
+              <w:left w:val="nil" w:color="auto" w:sz="0"/>
+              <w:bottom w:val="single" w:color="F0F4F8" w:sz="1"/>
+              <w:right w:val="nil" w:color="auto" w:sz="0"/>
+            </w:tcBorders>
+            <w:shd w:fill="FFFFFF" w:val="clear"/>
+            <w:tcMar>
+              <w:top w:type="dxa" w:w="120"/>
+              <w:left w:type="dxa" w:w="80"/>
+              <w:bottom w:type="dxa" w:w="120"/>
+              <w:right w:type="dxa" w:w="200"/>
+            </w:tcMar>
+            <w:vAlign w:val="top"/>
+          </w:tcPr>
+          <w:p>
+            <w:pPr>
+              <w:spacing w:after="40" w:before="0"/>
+            </w:pPr>
+            <w:r>
+              <w:rPr>
+                <w:rFonts w:ascii="Arial" w:cs="Arial" w:eastAsia="Arial" w:hAnsi="Arial"/>
+                <w:b/>
+                <w:bCs/>
+                <w:color w:val="1A2332"/>
+                <w:sz w:val="20"/>
+                <w:szCs w:val="20"/>
+              </w:rPr>
+              <w:t xml:space="preserve">Panel “Resúmenes Semanales de Tareas” en el dashboard (above the fold)</w:t>
+            </w:r>
+          </w:p>
+          <w:p>
+            <w:pPr>
+              <w:spacing w:after="0" w:before="0"/>
+            </w:pPr>
+            <w:r>
+              <w:rPr>
+                <w:rFonts w:ascii="Arial" w:cs="Arial" w:eastAsia="Arial" w:hAnsi="Arial"/>
+                <w:color w:val="4B5563"/>
+                <w:sz w:val="18"/>
+                <w:szCs w:val="18"/>
+              </w:rPr>
+              <w:t xml:space="preserve">Primer elemento visible tras el saludo. Muestra las tareas de la semana actual agrupadas por proyecto, con estado, fecha de vencimiento y botón “Ver tarea →” que abre el detalle directamente.</w:t>
+            </w:r>
+          </w:p>
+        </w:tc>
+      </w:tr>
+      <w:tr>
+        <w:tc>
+          <w:tcPr>
+            <w:tcW w:type="dxa" w:w="500"/>
+            <w:tcBorders>
+              <w:top w:val="nil" w:color="auto" w:sz="0"/>
+              <w:left w:val="nil" w:color="auto" w:sz="0"/>
+              <w:bottom w:val="single" w:color="F0F4F8" w:sz="1"/>
+              <w:right w:val="nil" w:color="auto" w:sz="0"/>
+            </w:tcBorders>
+            <w:shd w:fill="FFFFFF" w:val="clear"/>
+            <w:tcMar>
+              <w:top w:type="dxa" w:w="120"/>
+              <w:left w:type="dxa" w:w="200"/>
+              <w:bottom w:type="dxa" w:w="120"/>
+              <w:right w:type="dxa" w:w="80"/>
+            </w:tcMar>
+            <w:vAlign w:val="top"/>
+          </w:tcPr>
+          <w:p>
+            <w:pPr>
+              <w:spacing w:after="0" w:before="0"/>
+            </w:pPr>
+            <w:r>
+              <w:rPr>
+                <w:rFonts w:ascii="Segoe UI Emoji" w:cs="Segoe UI Emoji" w:eastAsia="Segoe UI Emoji" w:hAnsi="Segoe UI Emoji"/>
+                <w:sz w:val="20"/>
+                <w:szCs w:val="20"/>
+              </w:rPr>
+              <w:t xml:space="preserve">✅</w:t>
+            </w:r>
+          </w:p>
+        </w:tc>
+        <w:tc>
+          <w:tcPr>
+            <w:tcW w:type="dxa" w:w="9580"/>
+            <w:tcBorders>
+              <w:top w:val="nil" w:color="auto" w:sz="0"/>
+              <w:left w:val="nil" w:color="auto" w:sz="0"/>
+              <w:bottom w:val="single" w:color="F0F4F8" w:sz="1"/>
+              <w:right w:val="nil" w:color="auto" w:sz="0"/>
+            </w:tcBorders>
+            <w:shd w:fill="FFFFFF" w:val="clear"/>
+            <w:tcMar>
+              <w:top w:type="dxa" w:w="120"/>
+              <w:left w:type="dxa" w:w="80"/>
+              <w:bottom w:type="dxa" w:w="120"/>
+              <w:right w:type="dxa" w:w="200"/>
+            </w:tcMar>
+            <w:vAlign w:val="top"/>
+          </w:tcPr>
+          <w:p>
+            <w:pPr>
+              <w:spacing w:after="40" w:before="0"/>
+            </w:pPr>
+            <w:r>
+              <w:rPr>
+                <w:rFonts w:ascii="Arial" w:cs="Arial" w:eastAsia="Arial" w:hAnsi="Arial"/>
+                <w:b/>
+                <w:bCs/>
+                <w:color w:val="1A2332"/>
+                <w:sz w:val="20"/>
+                <w:szCs w:val="20"/>
+              </w:rPr>
+              <w:t xml:space="preserve">Sección “Semana pasada” — snapshot histórico en base de datos</w:t>
+            </w:r>
+          </w:p>
+          <w:p>
+            <w:pPr>
+              <w:spacing w:after="0" w:before="0"/>
+            </w:pPr>
+            <w:r>
+              <w:rPr>
+                <w:rFonts w:ascii="Arial" w:cs="Arial" w:eastAsia="Arial" w:hAnsi="Arial"/>
+                <w:color w:val="4B5563"/>
+                <w:sz w:val="18"/>
+                <w:szCs w:val="18"/>
+              </w:rPr>
+              <w:t xml:space="preserve">El estado de las tareas al cierre de cada semana queda persistido en la tabla user_weekly_summaries. Disponible aunque las tareas se cierren, reasignen o eliminen. Indicador de no leído (punto azul) si el resumen aún no fue revisado.</w:t>
+            </w:r>
+          </w:p>
+        </w:tc>
+      </w:tr>
+      <w:tr>
+        <w:tc>
+          <w:tcPr>
+            <w:tcW w:type="dxa" w:w="500"/>
+            <w:tcBorders>
+              <w:top w:val="nil" w:color="auto" w:sz="0"/>
+              <w:left w:val="nil" w:color="auto" w:sz="0"/>
+              <w:bottom w:val="single" w:color="F0F4F8" w:sz="1"/>
+              <w:right w:val="nil" w:color="auto" w:sz="0"/>
+            </w:tcBorders>
+            <w:shd w:fill="FFFFFF" w:val="clear"/>
+            <w:tcMar>
+              <w:top w:type="dxa" w:w="120"/>
+              <w:left w:type="dxa" w:w="200"/>
+              <w:bottom w:type="dxa" w:w="120"/>
+              <w:right w:type="dxa" w:w="80"/>
+            </w:tcMar>
+            <w:vAlign w:val="top"/>
+          </w:tcPr>
+          <w:p>
+            <w:pPr>
+              <w:spacing w:after="0" w:before="0"/>
+            </w:pPr>
+            <w:r>
+              <w:rPr>
+                <w:rFonts w:ascii="Segoe UI Emoji" w:cs="Segoe UI Emoji" w:eastAsia="Segoe UI Emoji" w:hAnsi="Segoe UI Emoji"/>
+                <w:sz w:val="20"/>
+                <w:szCs w:val="20"/>
+              </w:rPr>
+              <w:t xml:space="preserve">✅</w:t>
+            </w:r>
+          </w:p>
+        </w:tc>
+        <w:tc>
+          <w:tcPr>
+            <w:tcW w:type="dxa" w:w="9580"/>
+            <w:tcBorders>
+              <w:top w:val="nil" w:color="auto" w:sz="0"/>
+              <w:left w:val="nil" w:color="auto" w:sz="0"/>
+              <w:bottom w:val="single" w:color="F0F4F8" w:sz="1"/>
+              <w:right w:val="nil" w:color="auto" w:sz="0"/>
+            </w:tcBorders>
+            <w:shd w:fill="FFFFFF" w:val="clear"/>
+            <w:tcMar>
+              <w:top w:type="dxa" w:w="120"/>
+              <w:left w:type="dxa" w:w="80"/>
+              <w:bottom w:type="dxa" w:w="120"/>
+              <w:right w:type="dxa" w:w="200"/>
+            </w:tcMar>
+            <w:vAlign w:val="top"/>
+          </w:tcPr>
+          <w:p>
+            <w:pPr>
+              <w:spacing w:after="40" w:before="0"/>
+            </w:pPr>
+            <w:r>
+              <w:rPr>
+                <w:rFonts w:ascii="Arial" w:cs="Arial" w:eastAsia="Arial" w:hAnsi="Arial"/>
+                <w:b/>
+                <w:bCs/>
+                <w:color w:val="1A2332"/>
+                <w:sz w:val="20"/>
+                <w:szCs w:val="20"/>
+              </w:rPr>
+              <w:t xml:space="preserve">Botón “Ver tarea →” con navegación directa al detalle</w:t>
+            </w:r>
+          </w:p>
+          <w:p>
+            <w:pPr>
+              <w:spacing w:after="0" w:before="0"/>
+            </w:pPr>
+            <w:r>
+              <w:rPr>
+                <w:rFonts w:ascii="Arial" w:cs="Arial" w:eastAsia="Arial" w:hAnsi="Arial"/>
+                <w:color w:val="4B5563"/>
+                <w:sz w:val="18"/>
+                <w:szCs w:val="18"/>
+              </w:rPr>
+              <w:t xml:space="preserve">Cada tarea tiene un botón que navega al módulo Tareas y abre el modal de detalle automáticamente (deep-link vía location.state.taskId). También soporta enlace externo para tareas en snapshots históricos.</w:t>
+            </w:r>
+          </w:p>
+        </w:tc>
+      </w:tr>
+      <w:tr>
+        <w:tc>
+          <w:tcPr>
+            <w:tcW w:type="dxa" w:w="500"/>
+            <w:tcBorders>
+              <w:top w:val="nil" w:color="auto" w:sz="0"/>
+              <w:left w:val="nil" w:color="auto" w:sz="0"/>
+              <w:bottom w:val="single" w:color="F0F4F8" w:sz="1"/>
+              <w:right w:val="nil" w:color="auto" w:sz="0"/>
+            </w:tcBorders>
+            <w:shd w:fill="FFFFFF" w:val="clear"/>
+            <w:tcMar>
+              <w:top w:type="dxa" w:w="120"/>
+              <w:left w:type="dxa" w:w="200"/>
+              <w:bottom w:type="dxa" w:w="120"/>
+              <w:right w:type="dxa" w:w="80"/>
+            </w:tcMar>
+            <w:vAlign w:val="top"/>
+          </w:tcPr>
+          <w:p>
+            <w:pPr>
+              <w:spacing w:after="0" w:before="0"/>
+            </w:pPr>
+            <w:r>
+              <w:rPr>
+                <w:rFonts w:ascii="Segoe UI Emoji" w:cs="Segoe UI Emoji" w:eastAsia="Segoe UI Emoji" w:hAnsi="Segoe UI Emoji"/>
+                <w:sz w:val="20"/>
+                <w:szCs w:val="20"/>
+              </w:rPr>
+              <w:t xml:space="preserve">✅</w:t>
+            </w:r>
+          </w:p>
+        </w:tc>
+        <w:tc>
+          <w:tcPr>
+            <w:tcW w:type="dxa" w:w="9580"/>
+            <w:tcBorders>
+              <w:top w:val="nil" w:color="auto" w:sz="0"/>
+              <w:left w:val="nil" w:color="auto" w:sz="0"/>
+              <w:bottom w:val="single" w:color="F0F4F8" w:sz="1"/>
+              <w:right w:val="nil" w:color="auto" w:sz="0"/>
+            </w:tcBorders>
+            <w:shd w:fill="FFFFFF" w:val="clear"/>
+            <w:tcMar>
+              <w:top w:type="dxa" w:w="120"/>
+              <w:left w:type="dxa" w:w="80"/>
+              <w:bottom w:type="dxa" w:w="120"/>
+              <w:right w:type="dxa" w:w="200"/>
+            </w:tcMar>
+            <w:vAlign w:val="top"/>
+          </w:tcPr>
+          <w:p>
+            <w:pPr>
+              <w:spacing w:after="40" w:before="0"/>
+            </w:pPr>
+            <w:r>
+              <w:rPr>
+                <w:rFonts w:ascii="Arial" w:cs="Arial" w:eastAsia="Arial" w:hAnsi="Arial"/>
+                <w:b/>
+                <w:bCs/>
+                <w:color w:val="1A2332"/>
+                <w:sz w:val="20"/>
+                <w:szCs w:val="20"/>
+              </w:rPr>
+              <w:t xml:space="preserve">Reorganización del dashboard</w:t>
+            </w:r>
+          </w:p>
+          <w:p>
+            <w:pPr>
+              <w:spacing w:after="0" w:before="0"/>
+            </w:pPr>
+            <w:r>
+              <w:rPr>
+                <w:rFonts w:ascii="Arial" w:cs="Arial" w:eastAsia="Arial" w:hAnsi="Arial"/>
+                <w:color w:val="4B5563"/>
+                <w:sz w:val="18"/>
+                <w:szCs w:val="18"/>
+              </w:rPr>
+              <w:t xml:space="preserve">Eliminadas las 4 tarjetas métricas del área principal (proyectos activos, completados, en producción, ingresos). El banner “Próxima Reunión” fue movido a Configuración → Canal de Soporte como cuarta tarjeta de la sección.</w:t>
+            </w:r>
+          </w:p>
+        </w:tc>
+      </w:tr>
+      <w:tr>
+        <w:tc>
+          <w:tcPr>
+            <w:tcW w:type="dxa" w:w="500"/>
+            <w:tcBorders>
+              <w:top w:val="nil" w:color="auto" w:sz="0"/>
+              <w:left w:val="nil" w:color="auto" w:sz="0"/>
+              <w:bottom w:val="nil" w:color="auto" w:sz="0"/>
+              <w:right w:val="nil" w:color="auto" w:sz="0"/>
+            </w:tcBorders>
+            <w:shd w:fill="FFFFFF" w:val="clear"/>
+            <w:tcMar>
+              <w:top w:type="dxa" w:w="120"/>
+              <w:left w:type="dxa" w:w="200"/>
+              <w:bottom w:type="dxa" w:w="120"/>
+              <w:right w:type="dxa" w:w="80"/>
+            </w:tcMar>
+            <w:vAlign w:val="top"/>
+          </w:tcPr>
+          <w:p>
+            <w:pPr>
+              <w:spacing w:after="0" w:before="0"/>
+            </w:pPr>
+            <w:r>
+              <w:rPr>
+                <w:rFonts w:ascii="Segoe UI Emoji" w:cs="Segoe UI Emoji" w:eastAsia="Segoe UI Emoji" w:hAnsi="Segoe UI Emoji"/>
+                <w:sz w:val="20"/>
+                <w:szCs w:val="20"/>
+              </w:rPr>
+              <w:t xml:space="preserve">✅</w:t>
+            </w:r>
+          </w:p>
+        </w:tc>
+        <w:tc>
+          <w:tcPr>
+            <w:tcW w:type="dxa" w:w="9580"/>
+            <w:tcBorders>
+              <w:top w:val="nil" w:color="auto" w:sz="0"/>
+              <w:left w:val="nil" w:color="auto" w:sz="0"/>
+              <w:bottom w:val="nil" w:color="auto" w:sz="0"/>
+              <w:right w:val="nil" w:color="auto" w:sz="0"/>
+            </w:tcBorders>
+            <w:shd w:fill="FFFFFF" w:val="clear"/>
+            <w:tcMar>
+              <w:top w:type="dxa" w:w="120"/>
+              <w:left w:type="dxa" w:w="80"/>
+              <w:bottom w:type="dxa" w:w="120"/>
+              <w:right w:type="dxa" w:w="200"/>
+            </w:tcMar>
+            <w:vAlign w:val="top"/>
+          </w:tcPr>
+          <w:p>
+            <w:pPr>
+              <w:spacing w:after="40" w:before="0"/>
+            </w:pPr>
+            <w:r>
+              <w:rPr>
+                <w:rFonts w:ascii="Arial" w:cs="Arial" w:eastAsia="Arial" w:hAnsi="Arial"/>
+                <w:b/>
+                <w:bCs/>
+                <w:color w:val="1A2332"/>
+                <w:sz w:val="20"/>
+                <w:szCs w:val="20"/>
+              </w:rPr>
+              <w:t xml:space="preserve">Documentación publicada en /docs</w:t>
+            </w:r>
+          </w:p>
+          <w:p>
+            <w:pPr>
+              <w:spacing w:after="0" w:before="0"/>
+            </w:pPr>
+            <w:r>
+              <w:rPr>
+                <w:rFonts w:ascii="Arial" w:cs="Arial" w:eastAsia="Arial" w:hAnsi="Arial"/>
+                <w:color w:val="4B5563"/>
+                <w:sz w:val="18"/>
+                <w:szCs w:val="18"/>
+              </w:rPr>
+              <w:t xml:space="preserve">Entrada “Resumen Semanal de Tareas” agregada en dos secciones: tarjeta en Habilidades (docsData.ts, sort_order 128) y ficha completa como Automatización #31 en automatizacionesContent.ts con flujo visual, métricas, pasos y rutas de código.</w:t>
+            </w:r>
+          </w:p>
+        </w:tc>
+      </w:tr>
+    </w:tbl>
     <w:sectPr>
       <w:headerReference w:type="default" r:id="rId7"/>
       <w:footerReference w:type="default" r:id="rId8"/>

</xml_diff>